<commit_message>
docs: correct final submission claims
</commit_message>
<xml_diff>
--- a/submission/Aegis_Project_Description.docx
+++ b/submission/Aegis_Project_Description.docx
@@ -167,7 +167,7 @@
                 <w:color w:val="212529"/>
                 <w:sz w:val="19"/>
               </w:rPr>
-              <w:t>Verified MediaPipe CPU Baseline | QNN Optimization Ready</w:t>
+              <w:t>Verified MediaPipe CPU Baseline | QNN Optimization Planned</w:t>
             </w:r>
           </w:p>
         </w:tc>
@@ -180,6 +180,7 @@
     </w:p>
     <w:p>
       <w:pPr>
+        <w:keepNext/>
         <w:spacing w:before="280" w:after="80"/>
       </w:pPr>
       <w:r>
@@ -187,14 +188,14 @@
           <w:rFonts w:ascii="Segoe UI" w:hAnsi="Segoe UI"/>
           <w:b/>
           <w:color w:val="0B2545"/>
-          <w:sz w:val="28"/>
+          <w:sz w:val="26"/>
         </w:rPr>
         <w:t>1. Executive Summary</w:t>
       </w:r>
     </w:p>
     <w:p>
       <w:pPr>
-        <w:spacing w:before="0" w:after="100" w:line="276" w:lineRule="auto"/>
+        <w:spacing w:before="0" w:after="120"/>
       </w:pPr>
       <w:r>
         <w:rPr>
@@ -202,11 +203,12 @@
           <w:color w:val="212529"/>
           <w:sz w:val="20"/>
         </w:rPr>
-        <w:t>Aegis is an edge-native, privacy-preserving motion intelligence system engineered for real-time human movement and threat pattern analysis on Snapdragon-powered HP PCs. The system transforms live optical camera feeds into normalized 2D skeletal landmarks, evaluates multi-frame kinematic trajectories over a temporal sliding window, and identifies strikes, defensive guards, rapid approach, and fall patterns. Crucially, Aegis processes video entirely in local memory without transmitting imagery to cloud servers, stores no biometric templates, and does not perform facial recognition. By uniting zero-cloud on-device inference with explainable kinematic evidence, Aegis provides transparent decision-support telemetry for sports coaching, supervised athletic safety, and edge AI research.</w:t>
+        <w:t>Aegis is an edge-native, privacy-preserving motion intelligence system engineered for real-time human movement and threat pattern analysis on Snapdragon-powered HP PCs. The system transforms live optical camera feeds into normalized 2D skeletal landmarks, evaluates multi-frame kinematic trajectories over a temporal sliding window, and identifies strikes, defensive guards, rapid approach, and fall patterns. Crucially, Aegis processes video entirely in local memory without transmitting imagery to cloud servers, stores no biometric templates, and does not perform facial recognition. Aegis does not perform face recognition, face identification, facial embeddings or biometric identity tracking. One coarse nose keypoint is used only for pose geometry. By uniting zero-cloud on-device inference with explainable kinematic evidence, Aegis provides transparent decision-support telemetry for sports coaching, supervised athletic safety, and edge AI research.</w:t>
       </w:r>
     </w:p>
     <w:p>
       <w:pPr>
+        <w:keepNext/>
         <w:spacing w:before="280" w:after="80"/>
       </w:pPr>
       <w:r>
@@ -214,14 +216,14 @@
           <w:rFonts w:ascii="Segoe UI" w:hAnsi="Segoe UI"/>
           <w:b/>
           <w:color w:val="0B2545"/>
-          <w:sz w:val="28"/>
+          <w:sz w:val="26"/>
         </w:rPr>
         <w:t>2. Problem Statement</w:t>
       </w:r>
     </w:p>
     <w:p>
       <w:pPr>
-        <w:spacing w:before="0" w:after="100" w:line="276" w:lineRule="auto"/>
+        <w:spacing w:before="0" w:after="120"/>
       </w:pPr>
       <w:r>
         <w:rPr>
@@ -235,7 +237,7 @@
     <w:p>
       <w:pPr>
         <w:pStyle w:val="ListBullet"/>
-        <w:spacing w:before="0" w:after="60" w:line="276" w:lineRule="auto"/>
+        <w:spacing w:before="0" w:after="60"/>
       </w:pPr>
       <w:r>
         <w:rPr>
@@ -258,7 +260,7 @@
     <w:p>
       <w:pPr>
         <w:pStyle w:val="ListBullet"/>
-        <w:spacing w:before="0" w:after="60" w:line="276" w:lineRule="auto"/>
+        <w:spacing w:before="0" w:after="60"/>
       </w:pPr>
       <w:r>
         <w:rPr>
@@ -281,7 +283,7 @@
     <w:p>
       <w:pPr>
         <w:pStyle w:val="ListBullet"/>
-        <w:spacing w:before="0" w:after="60" w:line="276" w:lineRule="auto"/>
+        <w:spacing w:before="0" w:after="60"/>
       </w:pPr>
       <w:r>
         <w:rPr>
@@ -304,7 +306,7 @@
     <w:p>
       <w:pPr>
         <w:pStyle w:val="ListBullet"/>
-        <w:spacing w:before="0" w:after="60" w:line="276" w:lineRule="auto"/>
+        <w:spacing w:before="0" w:after="60"/>
       </w:pPr>
       <w:r>
         <w:rPr>
@@ -326,6 +328,7 @@
     </w:p>
     <w:p>
       <w:pPr>
+        <w:keepNext/>
         <w:spacing w:before="280" w:after="80"/>
       </w:pPr>
       <w:r>
@@ -333,14 +336,14 @@
           <w:rFonts w:ascii="Segoe UI" w:hAnsi="Segoe UI"/>
           <w:b/>
           <w:color w:val="0B2545"/>
-          <w:sz w:val="28"/>
+          <w:sz w:val="26"/>
         </w:rPr>
         <w:t>3. Proposed Solution</w:t>
       </w:r>
     </w:p>
     <w:p>
       <w:pPr>
-        <w:spacing w:before="0" w:after="100" w:line="276" w:lineRule="auto"/>
+        <w:spacing w:before="0" w:after="120"/>
       </w:pPr>
       <w:r>
         <w:rPr>
@@ -354,7 +357,7 @@
     <w:p>
       <w:pPr>
         <w:pStyle w:val="ListBullet"/>
-        <w:spacing w:before="0" w:after="60" w:line="276" w:lineRule="auto"/>
+        <w:spacing w:before="0" w:after="60"/>
       </w:pPr>
       <w:r>
         <w:rPr>
@@ -377,7 +380,7 @@
     <w:p>
       <w:pPr>
         <w:pStyle w:val="ListBullet"/>
-        <w:spacing w:before="0" w:after="60" w:line="276" w:lineRule="auto"/>
+        <w:spacing w:before="0" w:after="60"/>
       </w:pPr>
       <w:r>
         <w:rPr>
@@ -394,13 +397,13 @@
           <w:color w:val="212529"/>
           <w:sz w:val="20"/>
         </w:rPr>
-        <w:t xml:space="preserve"> Completely abstracts human subjects into 9 skeletal joint coordinates (nose, shoulders, wrists, hips, ankles), stripping facial geometry, clothing, ethnicity, and identity.</w:t>
+        <w:t xml:space="preserve"> Completely abstracts human subjects into 9 skeletal joint coordinates (nose, shoulders, wrists, hips, ankles), stripping clothing, ethnicity, and identity. Aegis does not perform face recognition, face identification, facial embeddings or biometric identity tracking. One coarse nose keypoint is used only for pose geometry.</w:t>
       </w:r>
     </w:p>
     <w:p>
       <w:pPr>
         <w:pStyle w:val="ListBullet"/>
-        <w:spacing w:before="0" w:after="60" w:line="276" w:lineRule="auto"/>
+        <w:spacing w:before="0" w:after="60"/>
       </w:pPr>
       <w:r>
         <w:rPr>
@@ -423,7 +426,7 @@
     <w:p>
       <w:pPr>
         <w:pStyle w:val="ListBullet"/>
-        <w:spacing w:before="0" w:after="60" w:line="276" w:lineRule="auto"/>
+        <w:spacing w:before="0" w:after="60"/>
       </w:pPr>
       <w:r>
         <w:rPr>
@@ -502,6 +505,7 @@
     </w:p>
     <w:p>
       <w:pPr>
+        <w:keepNext/>
         <w:spacing w:before="280" w:after="80"/>
       </w:pPr>
       <w:r>
@@ -509,7 +513,7 @@
           <w:rFonts w:ascii="Segoe UI" w:hAnsi="Segoe UI"/>
           <w:b/>
           <w:color w:val="0B2545"/>
-          <w:sz w:val="28"/>
+          <w:sz w:val="26"/>
         </w:rPr>
         <w:t>4. Target Users and Use Cases</w:t>
       </w:r>
@@ -517,7 +521,7 @@
     <w:p>
       <w:pPr>
         <w:pStyle w:val="ListBullet"/>
-        <w:spacing w:before="0" w:after="60" w:line="276" w:lineRule="auto"/>
+        <w:spacing w:before="0" w:after="60"/>
       </w:pPr>
       <w:r>
         <w:rPr>
@@ -540,7 +544,7 @@
     <w:p>
       <w:pPr>
         <w:pStyle w:val="ListBullet"/>
-        <w:spacing w:before="0" w:after="60" w:line="276" w:lineRule="auto"/>
+        <w:spacing w:before="0" w:after="60"/>
       </w:pPr>
       <w:r>
         <w:rPr>
@@ -563,7 +567,7 @@
     <w:p>
       <w:pPr>
         <w:pStyle w:val="ListBullet"/>
-        <w:spacing w:before="0" w:after="60" w:line="276" w:lineRule="auto"/>
+        <w:spacing w:before="0" w:after="60"/>
       </w:pPr>
       <w:r>
         <w:rPr>
@@ -585,6 +589,7 @@
     </w:p>
     <w:p>
       <w:pPr>
+        <w:keepNext/>
         <w:spacing w:before="280" w:after="80"/>
       </w:pPr>
       <w:r>
@@ -592,14 +597,14 @@
           <w:rFonts w:ascii="Segoe UI" w:hAnsi="Segoe UI"/>
           <w:b/>
           <w:color w:val="0B2545"/>
-          <w:sz w:val="28"/>
+          <w:sz w:val="26"/>
         </w:rPr>
         <w:t>5. System Architecture &amp; Technical Implementation</w:t>
       </w:r>
     </w:p>
     <w:p>
       <w:pPr>
-        <w:spacing w:before="0" w:after="100" w:line="276" w:lineRule="auto"/>
+        <w:spacing w:before="0" w:after="120"/>
       </w:pPr>
       <w:r>
         <w:rPr>
@@ -613,7 +618,7 @@
     <w:p>
       <w:pPr>
         <w:pStyle w:val="ListBullet"/>
-        <w:spacing w:before="0" w:after="60" w:line="276" w:lineRule="auto"/>
+        <w:spacing w:before="0" w:after="60"/>
       </w:pPr>
       <w:r>
         <w:rPr>
@@ -636,7 +641,7 @@
     <w:p>
       <w:pPr>
         <w:pStyle w:val="ListBullet"/>
-        <w:spacing w:before="0" w:after="60" w:line="276" w:lineRule="auto"/>
+        <w:spacing w:before="0" w:after="60"/>
       </w:pPr>
       <w:r>
         <w:rPr>
@@ -659,7 +664,7 @@
     <w:p>
       <w:pPr>
         <w:pStyle w:val="ListBullet"/>
-        <w:spacing w:before="0" w:after="60" w:line="276" w:lineRule="auto"/>
+        <w:spacing w:before="0" w:after="60"/>
       </w:pPr>
       <w:r>
         <w:rPr>
@@ -682,7 +687,7 @@
     <w:p>
       <w:pPr>
         <w:pStyle w:val="ListBullet"/>
-        <w:spacing w:before="0" w:after="60" w:line="276" w:lineRule="auto"/>
+        <w:spacing w:before="0" w:after="60"/>
       </w:pPr>
       <w:r>
         <w:rPr>
@@ -705,7 +710,7 @@
     <w:p>
       <w:pPr>
         <w:pStyle w:val="ListBullet"/>
-        <w:spacing w:before="0" w:after="60" w:line="276" w:lineRule="auto"/>
+        <w:spacing w:before="0" w:after="60"/>
       </w:pPr>
       <w:r>
         <w:rPr>
@@ -728,7 +733,7 @@
     <w:p>
       <w:pPr>
         <w:pStyle w:val="ListBullet"/>
-        <w:spacing w:before="0" w:after="60" w:line="276" w:lineRule="auto"/>
+        <w:spacing w:before="0" w:after="60"/>
       </w:pPr>
       <w:r>
         <w:rPr>
@@ -750,6 +755,7 @@
     </w:p>
     <w:p>
       <w:pPr>
+        <w:keepNext/>
         <w:spacing w:before="280" w:after="80"/>
       </w:pPr>
       <w:r>
@@ -757,14 +763,14 @@
           <w:rFonts w:ascii="Segoe UI" w:hAnsi="Segoe UI"/>
           <w:b/>
           <w:color w:val="0B2545"/>
-          <w:sz w:val="28"/>
+          <w:sz w:val="26"/>
         </w:rPr>
         <w:t>6. Pattern-Detection Methodology</w:t>
       </w:r>
     </w:p>
     <w:p>
       <w:pPr>
-        <w:spacing w:before="0" w:after="100" w:line="276" w:lineRule="auto"/>
+        <w:spacing w:before="0" w:after="120"/>
       </w:pPr>
       <w:r>
         <w:rPr>
@@ -996,7 +1002,7 @@
                 <w:color w:val="212529"/>
                 <w:sz w:val="17"/>
               </w:rPr>
-              <w:t>Wrists within 1.30x shoulder width of face</w:t>
+              <w:t>Wrists within 1.30x shoulder width of nose</w:t>
             </w:r>
           </w:p>
         </w:tc>
@@ -1449,6 +1455,7 @@
     </w:p>
     <w:p>
       <w:pPr>
+        <w:keepNext/>
         <w:spacing w:before="280" w:after="80"/>
       </w:pPr>
       <w:r>
@@ -1456,14 +1463,14 @@
           <w:rFonts w:ascii="Segoe UI" w:hAnsi="Segoe UI"/>
           <w:b/>
           <w:color w:val="0B2545"/>
-          <w:sz w:val="28"/>
+          <w:sz w:val="26"/>
         </w:rPr>
         <w:t>7. Explainability &amp; Human-in-the-Loop Telemetry</w:t>
       </w:r>
     </w:p>
     <w:p>
       <w:pPr>
-        <w:spacing w:before="0" w:after="100" w:line="276" w:lineRule="auto"/>
+        <w:spacing w:before="0" w:after="120"/>
       </w:pPr>
       <w:r>
         <w:rPr>
@@ -1476,6 +1483,7 @@
     </w:p>
     <w:p>
       <w:pPr>
+        <w:keepNext/>
         <w:spacing w:before="280" w:after="80"/>
       </w:pPr>
       <w:r>
@@ -1483,7 +1491,7 @@
           <w:rFonts w:ascii="Segoe UI" w:hAnsi="Segoe UI"/>
           <w:b/>
           <w:color w:val="0B2545"/>
-          <w:sz w:val="28"/>
+          <w:sz w:val="26"/>
         </w:rPr>
         <w:t>8. Privacy &amp; Responsible-Use Safeguards</w:t>
       </w:r>
@@ -1491,7 +1499,7 @@
     <w:p>
       <w:pPr>
         <w:pStyle w:val="ListBullet"/>
-        <w:spacing w:before="0" w:after="60" w:line="276" w:lineRule="auto"/>
+        <w:spacing w:before="0" w:after="60"/>
       </w:pPr>
       <w:r>
         <w:rPr>
@@ -1514,7 +1522,7 @@
     <w:p>
       <w:pPr>
         <w:pStyle w:val="ListBullet"/>
-        <w:spacing w:before="0" w:after="60" w:line="276" w:lineRule="auto"/>
+        <w:spacing w:before="0" w:after="60"/>
       </w:pPr>
       <w:r>
         <w:rPr>
@@ -1531,13 +1539,13 @@
           <w:color w:val="212529"/>
           <w:sz w:val="20"/>
         </w:rPr>
-        <w:t xml:space="preserve"> No facial biometric templates, eye tracking, or identity markers are captured or stored.</w:t>
+        <w:t xml:space="preserve"> Aegis does not perform face recognition, face identification, facial embeddings or biometric identity tracking. One coarse nose keypoint is used only for pose geometry.</w:t>
       </w:r>
     </w:p>
     <w:p>
       <w:pPr>
         <w:pStyle w:val="ListBullet"/>
-        <w:spacing w:before="0" w:after="60" w:line="276" w:lineRule="auto"/>
+        <w:spacing w:before="0" w:after="60"/>
       </w:pPr>
       <w:r>
         <w:rPr>
@@ -1560,7 +1568,7 @@
     <w:p>
       <w:pPr>
         <w:pStyle w:val="ListBullet"/>
-        <w:spacing w:before="0" w:after="60" w:line="276" w:lineRule="auto"/>
+        <w:spacing w:before="0" w:after="60"/>
       </w:pPr>
       <w:r>
         <w:rPr>
@@ -1582,6 +1590,7 @@
     </w:p>
     <w:p>
       <w:pPr>
+        <w:keepNext/>
         <w:spacing w:before="280" w:after="80"/>
       </w:pPr>
       <w:r>
@@ -1589,14 +1598,14 @@
           <w:rFonts w:ascii="Segoe UI" w:hAnsi="Segoe UI"/>
           <w:b/>
           <w:color w:val="0B2545"/>
-          <w:sz w:val="28"/>
+          <w:sz w:val="26"/>
         </w:rPr>
         <w:t>9. Current Verified Evidence &amp; Technical Truthfulness</w:t>
       </w:r>
     </w:p>
     <w:p>
       <w:pPr>
-        <w:spacing w:before="0" w:after="100" w:line="276" w:lineRule="auto"/>
+        <w:spacing w:before="0" w:after="120"/>
       </w:pPr>
       <w:r>
         <w:rPr>
@@ -1610,7 +1619,7 @@
     <w:p>
       <w:pPr>
         <w:pStyle w:val="ListBullet"/>
-        <w:spacing w:before="0" w:after="60" w:line="276" w:lineRule="auto"/>
+        <w:spacing w:before="0" w:after="60"/>
       </w:pPr>
       <w:r>
         <w:rPr>
@@ -1633,7 +1642,7 @@
     <w:p>
       <w:pPr>
         <w:pStyle w:val="ListBullet"/>
-        <w:spacing w:before="0" w:after="60" w:line="276" w:lineRule="auto"/>
+        <w:spacing w:before="0" w:after="60"/>
       </w:pPr>
       <w:r>
         <w:rPr>
@@ -1656,7 +1665,7 @@
     <w:p>
       <w:pPr>
         <w:pStyle w:val="ListBullet"/>
-        <w:spacing w:before="0" w:after="60" w:line="276" w:lineRule="auto"/>
+        <w:spacing w:before="0" w:after="60"/>
       </w:pPr>
       <w:r>
         <w:rPr>
@@ -1673,13 +1682,13 @@
           <w:color w:val="212529"/>
           <w:sz w:val="20"/>
         </w:rPr>
-        <w:t xml:space="preserve"> The active landmark engine is MediaPipe CPU. QNN/NPU execution is not falsely claimed.</w:t>
+        <w:t xml:space="preserve"> MediaPipe CPU is the only currently verified active pose provider. Supplying AEGIS_MODEL_PATH does not connect model outputs to pose estimation; runtime diagnostics only verify provider availability. Genuine QNN pose execution requires an ONNX/QNN pose-estimator adapter that preprocesses frames, calls session.run(), converts outputs to normalized PoseFrame landmarks, and replaces MediaPipePoseEstimator.</w:t>
       </w:r>
     </w:p>
     <w:p>
       <w:pPr>
         <w:pStyle w:val="ListBullet"/>
-        <w:spacing w:before="0" w:after="60" w:line="276" w:lineRule="auto"/>
+        <w:spacing w:before="0" w:after="60"/>
       </w:pPr>
       <w:r>
         <w:rPr>
@@ -1701,6 +1710,7 @@
     </w:p>
     <w:p>
       <w:pPr>
+        <w:keepNext/>
         <w:spacing w:before="280" w:after="80"/>
       </w:pPr>
       <w:r>
@@ -1708,14 +1718,14 @@
           <w:rFonts w:ascii="Segoe UI" w:hAnsi="Segoe UI"/>
           <w:b/>
           <w:color w:val="0B2545"/>
-          <w:sz w:val="28"/>
+          <w:sz w:val="26"/>
         </w:rPr>
-        <w:t>10. Snapdragon Optimization Plan &amp; Qualcomm AI Hub</w:t>
+        <w:t>10. Snapdragon Optimization Plan &amp; Qualcomm AI Hub (Planned)</w:t>
       </w:r>
     </w:p>
     <w:p>
       <w:pPr>
-        <w:spacing w:before="0" w:after="100" w:line="276" w:lineRule="auto"/>
+        <w:spacing w:before="0" w:after="120"/>
       </w:pPr>
       <w:r>
         <w:rPr>
@@ -1723,13 +1733,13 @@
           <w:color w:val="212529"/>
           <w:sz w:val="20"/>
         </w:rPr>
-        <w:t>Aegis features a modular runtime interface designed for frictionless transition to Qualcomm Hexagon NPUs on Snapdragon-powered HP PCs:</w:t>
+        <w:t>Aegis features a modular runtime interface designed for transition to Qualcomm Hexagon NPUs on Snapdragon-powered HP PCs. Supplying AEGIS_MODEL_PATH does not connect model outputs to pose estimation; runtime diagnostics only verify provider availability. MediaPipe CPU is the only currently verified active pose provider. The planned optimization pathway includes:</w:t>
       </w:r>
     </w:p>
     <w:p>
       <w:pPr>
         <w:pStyle w:val="ListBullet"/>
-        <w:spacing w:before="0" w:after="60" w:line="276" w:lineRule="auto"/>
+        <w:spacing w:before="0" w:after="60"/>
       </w:pPr>
       <w:r>
         <w:rPr>
@@ -1738,7 +1748,7 @@
           <w:color w:val="0B2545"/>
           <w:sz w:val="20"/>
         </w:rPr>
-        <w:t>1. Model Selection:</w:t>
+        <w:t>1. Model Selection (Planned):</w:t>
       </w:r>
       <w:r>
         <w:rPr>
@@ -1752,7 +1762,7 @@
     <w:p>
       <w:pPr>
         <w:pStyle w:val="ListBullet"/>
-        <w:spacing w:before="0" w:after="60" w:line="276" w:lineRule="auto"/>
+        <w:spacing w:before="0" w:after="60"/>
       </w:pPr>
       <w:r>
         <w:rPr>
@@ -1761,7 +1771,7 @@
           <w:color w:val="0B2545"/>
           <w:sz w:val="20"/>
         </w:rPr>
-        <w:t>2. Model Compilation:</w:t>
+        <w:t>2. Model Compilation (Planned):</w:t>
       </w:r>
       <w:r>
         <w:rPr>
@@ -1775,7 +1785,7 @@
     <w:p>
       <w:pPr>
         <w:pStyle w:val="ListBullet"/>
-        <w:spacing w:before="0" w:after="60" w:line="276" w:lineRule="auto"/>
+        <w:spacing w:before="0" w:after="60"/>
       </w:pPr>
       <w:r>
         <w:rPr>
@@ -1784,7 +1794,7 @@
           <w:color w:val="0B2545"/>
           <w:sz w:val="20"/>
         </w:rPr>
-        <w:t>3. NPU Execution:</w:t>
+        <w:t>3. NPU Execution (Planned):</w:t>
       </w:r>
       <w:r>
         <w:rPr>
@@ -1792,13 +1802,13 @@
           <w:color w:val="212529"/>
           <w:sz w:val="20"/>
         </w:rPr>
-        <w:t xml:space="preserve"> Deploy via ONNX Runtime using QNNExecutionProvider with Hexagon Tensor Processor backend delegates (QnnHtp.dll).</w:t>
+        <w:t xml:space="preserve"> Implement an ONNX/QNN pose-estimator adapter that preprocesses frames, calls session.run(), converts outputs to normalized PoseFrame landmarks, and replaces MediaPipePoseEstimator via ONNX Runtime QNNExecutionProvider (QnnHtp.dll).</w:t>
       </w:r>
     </w:p>
     <w:p>
       <w:pPr>
         <w:pStyle w:val="ListBullet"/>
-        <w:spacing w:before="0" w:after="60" w:line="276" w:lineRule="auto"/>
+        <w:spacing w:before="0" w:after="60"/>
       </w:pPr>
       <w:r>
         <w:rPr>
@@ -1807,7 +1817,7 @@
           <w:color w:val="0B2545"/>
           <w:sz w:val="20"/>
         </w:rPr>
-        <w:t>4. Verification Protocol:</w:t>
+        <w:t>4. Verification Protocol (Planned):</w:t>
       </w:r>
       <w:r>
         <w:rPr>
@@ -1820,6 +1830,7 @@
     </w:p>
     <w:p>
       <w:pPr>
+        <w:keepNext/>
         <w:spacing w:before="280" w:after="80"/>
       </w:pPr>
       <w:r>
@@ -1827,7 +1838,7 @@
           <w:rFonts w:ascii="Segoe UI" w:hAnsi="Segoe UI"/>
           <w:b/>
           <w:color w:val="0B2545"/>
-          <w:sz w:val="28"/>
+          <w:sz w:val="26"/>
         </w:rPr>
         <w:t>11. Accessibility &amp; Key Innovations</w:t>
       </w:r>
@@ -1835,7 +1846,7 @@
     <w:p>
       <w:pPr>
         <w:pStyle w:val="ListBullet"/>
-        <w:spacing w:before="0" w:after="60" w:line="276" w:lineRule="auto"/>
+        <w:spacing w:before="0" w:after="60"/>
       </w:pPr>
       <w:r>
         <w:rPr>
@@ -1858,7 +1869,7 @@
     <w:p>
       <w:pPr>
         <w:pStyle w:val="ListBullet"/>
-        <w:spacing w:before="0" w:after="60" w:line="276" w:lineRule="auto"/>
+        <w:spacing w:before="0" w:after="60"/>
       </w:pPr>
       <w:r>
         <w:rPr>
@@ -1881,7 +1892,7 @@
     <w:p>
       <w:pPr>
         <w:pStyle w:val="ListBullet"/>
-        <w:spacing w:before="0" w:after="60" w:line="276" w:lineRule="auto"/>
+        <w:spacing w:before="0" w:after="60"/>
       </w:pPr>
       <w:r>
         <w:rPr>
@@ -1903,6 +1914,7 @@
     </w:p>
     <w:p>
       <w:pPr>
+        <w:keepNext/>
         <w:spacing w:before="280" w:after="80"/>
       </w:pPr>
       <w:r>
@@ -1910,7 +1922,7 @@
           <w:rFonts w:ascii="Segoe UI" w:hAnsi="Segoe UI"/>
           <w:b/>
           <w:color w:val="0B2545"/>
-          <w:sz w:val="28"/>
+          <w:sz w:val="26"/>
         </w:rPr>
         <w:t>12. Limitations &amp; Future Roadmap</w:t>
       </w:r>
@@ -1918,7 +1930,7 @@
     <w:p>
       <w:pPr>
         <w:pStyle w:val="ListBullet"/>
-        <w:spacing w:before="0" w:after="60" w:line="276" w:lineRule="auto"/>
+        <w:spacing w:before="0" w:after="60"/>
       </w:pPr>
       <w:r>
         <w:rPr>
@@ -1941,7 +1953,7 @@
     <w:p>
       <w:pPr>
         <w:pStyle w:val="ListBullet"/>
-        <w:spacing w:before="0" w:after="60" w:line="276" w:lineRule="auto"/>
+        <w:spacing w:before="0" w:after="60"/>
       </w:pPr>
       <w:r>
         <w:rPr>

</xml_diff>